<commit_message>
SIT: rate limiting, security policy, pentest report, push instructions
</commit_message>
<xml_diff>
--- a/Docs/Downstream Hub PRD.docx
+++ b/Docs/Downstream Hub PRD.docx
@@ -54,7 +54,13 @@
       </w:r>
       <w:proofErr w:type="gramEnd"/>
       <w:r>
-        <w:t xml:space="preserve"> 25 Feb 2026</w:t>
+        <w:t xml:space="preserve"> 2</w:t>
+      </w:r>
+      <w:r>
+        <w:t>7</w:t>
+      </w:r>
+      <w:r>
+        <w:t xml:space="preserve"> Feb 2026</w:t>
       </w:r>
     </w:p>
     <w:p>
@@ -218,14 +224,130 @@
           <w:b/>
           <w:bCs/>
         </w:rPr>
-        <w:t>In-Scope:</w:t>
+        <w:t>In-Scope</w:t>
+      </w:r>
+      <w:r>
+        <w:rPr>
+          <w:b/>
+          <w:bCs/>
+        </w:rPr>
+        <w:t>:</w:t>
+      </w:r>
+      <w:r>
+        <w:t xml:space="preserve"> Self-registration/login (with BU selection and password retype</w:t>
+      </w:r>
+      <w:proofErr w:type="gramStart"/>
+      <w:r>
+        <w:t>) ,</w:t>
+      </w:r>
+      <w:proofErr w:type="gramEnd"/>
+      <w:r>
+        <w:t xml:space="preserve"> Admin-led user creation/</w:t>
+      </w:r>
+      <w:proofErr w:type="gramStart"/>
+      <w:r>
+        <w:t>deactivation ,</w:t>
+      </w:r>
+      <w:proofErr w:type="gramEnd"/>
+      <w:r>
+        <w:t xml:space="preserve"> Account Management (password/BU updates</w:t>
+      </w:r>
+      <w:proofErr w:type="gramStart"/>
+      <w:r>
+        <w:t>) ,</w:t>
+      </w:r>
+      <w:proofErr w:type="gramEnd"/>
+      <w:r>
+        <w:t xml:space="preserve"> Role Management (Admin/User</w:t>
+      </w:r>
+      <w:proofErr w:type="gramStart"/>
+      <w:r>
+        <w:t>) ,</w:t>
+      </w:r>
+      <w:proofErr w:type="gramEnd"/>
+      <w:r>
+        <w:t xml:space="preserve"> </w:t>
+      </w:r>
+      <w:r>
+        <w:rPr>
+          <w:b/>
+          <w:bCs/>
+        </w:rPr>
+        <w:t>)</w:t>
+      </w:r>
+      <w:r>
+        <w:t xml:space="preserve">, Password Expiry </w:t>
+      </w:r>
+      <w:proofErr w:type="gramStart"/>
+      <w:r>
+        <w:t>Enforcement</w:t>
+      </w:r>
+      <w:r>
+        <w:t xml:space="preserve">, </w:t>
       </w:r>
       <w:r>
         <w:t xml:space="preserve"> </w:t>
       </w:r>
       <w:r>
-        <w:t xml:space="preserve">Self-registration/login (with BU selection and password retype), Account Management (password/BU updates), Role Management (Admin/User), Password Expiry Enforcement, Grid view of applications (filtered by BU), Admin CRUD for apps and domains, and secure token hand-off </w:t>
+        <w:rPr>
+          <w:b/>
+          <w:bCs/>
+        </w:rPr>
+        <w:t>Configurable</w:t>
       </w:r>
+      <w:proofErr w:type="gramEnd"/>
+      <w:r>
+        <w:rPr>
+          <w:b/>
+          <w:bCs/>
+        </w:rPr>
+        <w:t xml:space="preserve"> Security Policies (</w:t>
+      </w:r>
+      <w:r>
+        <w:rPr>
+          <w:b/>
+          <w:bCs/>
+        </w:rPr>
+        <w:t xml:space="preserve">Password Expiry, </w:t>
+      </w:r>
+      <w:r>
+        <w:rPr>
+          <w:b/>
+          <w:bCs/>
+        </w:rPr>
+        <w:t>Complexity, History, and Lockout</w:t>
+      </w:r>
+      <w:r>
+        <w:rPr>
+          <w:b/>
+          <w:bCs/>
+        </w:rPr>
+        <w:t>)</w:t>
+      </w:r>
+      <w:r>
+        <w:t>, Grid view of applications (filtered by BU</w:t>
+      </w:r>
+      <w:proofErr w:type="gramStart"/>
+      <w:r>
+        <w:t>) ,</w:t>
+      </w:r>
+      <w:proofErr w:type="gramEnd"/>
+      <w:r>
+        <w:t xml:space="preserve"> Admin CRUD for apps and </w:t>
+      </w:r>
+      <w:proofErr w:type="gramStart"/>
+      <w:r>
+        <w:t>domains ,</w:t>
+      </w:r>
+      <w:proofErr w:type="gramEnd"/>
+      <w:r>
+        <w:t xml:space="preserve"> and secure token hand-off. </w:t>
+      </w:r>
+    </w:p>
+    <w:p>
+      <w:pPr>
+        <w:pStyle w:val="ListParagraph"/>
+      </w:pPr>
     </w:p>
     <w:p>
       <w:pPr>
@@ -263,7 +385,7 @@
         <w:pStyle w:val="ListParagraph"/>
         <w:numPr>
           <w:ilvl w:val="0"/>
-          <w:numId w:val="17"/>
+          <w:numId w:val="19"/>
         </w:numPr>
       </w:pPr>
       <w:r>
@@ -271,10 +393,10 @@
           <w:b/>
           <w:bCs/>
         </w:rPr>
-        <w:t>Identity Validation:</w:t>
+        <w:t>Identity Validation</w:t>
       </w:r>
       <w:r>
-        <w:t xml:space="preserve"> User registers with company email; system checks against the allowed domain whitelist.</w:t>
+        <w:t xml:space="preserve">: User registers with company email; system checks against the allowed domain whitelist. </w:t>
       </w:r>
     </w:p>
     <w:p>
@@ -282,7 +404,7 @@
         <w:pStyle w:val="ListParagraph"/>
         <w:numPr>
           <w:ilvl w:val="0"/>
-          <w:numId w:val="17"/>
+          <w:numId w:val="19"/>
         </w:numPr>
       </w:pPr>
       <w:r>
@@ -290,16 +412,10 @@
           <w:b/>
           <w:bCs/>
         </w:rPr>
-        <w:t>BU &amp; Security Selection:</w:t>
+        <w:t>BU &amp; Security Selection</w:t>
       </w:r>
       <w:r>
-        <w:t xml:space="preserve"> User selects their Business Unit and confirms </w:t>
-      </w:r>
-      <w:r>
-        <w:t xml:space="preserve">/ retype </w:t>
-      </w:r>
-      <w:r>
-        <w:t>their password during registration.</w:t>
+        <w:t xml:space="preserve">: User selects their Business Unit and confirms / retype their password during registration.  </w:t>
       </w:r>
     </w:p>
     <w:p>
@@ -307,37 +423,45 @@
         <w:pStyle w:val="ListParagraph"/>
         <w:numPr>
           <w:ilvl w:val="0"/>
-          <w:numId w:val="17"/>
+          <w:numId w:val="19"/>
         </w:numPr>
       </w:pPr>
+      <w:r>
+        <w:t xml:space="preserve">Passwords must meet complexity requirements set by Admin. </w:t>
+      </w:r>
+    </w:p>
+    <w:p>
+      <w:pPr>
+        <w:pStyle w:val="ListParagraph"/>
+        <w:numPr>
+          <w:ilvl w:val="0"/>
+          <w:numId w:val="19"/>
+        </w:numPr>
+      </w:pPr>
+      <w:proofErr w:type="gramStart"/>
       <w:r>
         <w:rPr>
           <w:b/>
           <w:bCs/>
         </w:rPr>
-        <w:t>User Login:</w:t>
+        <w:t>User</w:t>
       </w:r>
       <w:r>
-        <w:t xml:space="preserve"> User authenticates via Downstream Hub.</w:t>
+        <w:t xml:space="preserve"> </w:t>
       </w:r>
-    </w:p>
-    <w:p>
-      <w:pPr>
-        <w:pStyle w:val="ListParagraph"/>
-        <w:numPr>
-          <w:ilvl w:val="0"/>
-          <w:numId w:val="17"/>
-        </w:numPr>
-      </w:pPr>
+      <w:r>
+        <w:t xml:space="preserve"> </w:t>
+      </w:r>
       <w:r>
         <w:rPr>
           <w:b/>
           <w:bCs/>
         </w:rPr>
-        <w:t>Security Check:</w:t>
+        <w:t>Login</w:t>
       </w:r>
+      <w:proofErr w:type="gramEnd"/>
       <w:r>
-        <w:t xml:space="preserve"> System checks if password change is enforced (every $X$ months).</w:t>
+        <w:t xml:space="preserve">: User authenticates via Downstream Hub.  </w:t>
       </w:r>
     </w:p>
     <w:p>
@@ -345,7 +469,7 @@
         <w:pStyle w:val="ListParagraph"/>
         <w:numPr>
           <w:ilvl w:val="0"/>
-          <w:numId w:val="17"/>
+          <w:numId w:val="19"/>
         </w:numPr>
       </w:pPr>
       <w:r>
@@ -353,10 +477,10 @@
           <w:b/>
           <w:bCs/>
         </w:rPr>
-        <w:t>Dashboard (Filtered):</w:t>
+        <w:t>System enforces</w:t>
       </w:r>
       <w:r>
-        <w:t xml:space="preserve"> User views a grid of applications assigned specifically to their Business Unit or marked as "Global".</w:t>
+        <w:t xml:space="preserve"> account lockout based on Admin configuration.</w:t>
       </w:r>
     </w:p>
     <w:p>
@@ -364,7 +488,7 @@
         <w:pStyle w:val="ListParagraph"/>
         <w:numPr>
           <w:ilvl w:val="0"/>
-          <w:numId w:val="17"/>
+          <w:numId w:val="19"/>
         </w:numPr>
       </w:pPr>
       <w:r>
@@ -372,10 +496,10 @@
           <w:b/>
           <w:bCs/>
         </w:rPr>
-        <w:t>Account Management:</w:t>
+        <w:t>Security Check</w:t>
       </w:r>
       <w:r>
-        <w:t xml:space="preserve"> Users can update their own password or BU at any time.</w:t>
+        <w:t>: System checks if password change is enforced (every $X$ months).  New passwords cannot match the history limit set by Admin.</w:t>
       </w:r>
     </w:p>
     <w:p>
@@ -383,7 +507,7 @@
         <w:pStyle w:val="ListParagraph"/>
         <w:numPr>
           <w:ilvl w:val="0"/>
-          <w:numId w:val="17"/>
+          <w:numId w:val="19"/>
         </w:numPr>
       </w:pPr>
       <w:r>
@@ -391,11 +515,63 @@
           <w:b/>
           <w:bCs/>
         </w:rPr>
-        <w:t>App Selection &amp; SSO:</w:t>
+        <w:t>Dashboard</w:t>
       </w:r>
       <w:r>
-        <w:t xml:space="preserve"> User clicks an app; the Hub generates a secure token and redirects to the target app</w:t>
+        <w:t xml:space="preserve"> (Filtered): User views a grid of applications assigned specifically to their Business Unit or marked as "Global". </w:t>
       </w:r>
+    </w:p>
+    <w:p>
+      <w:pPr>
+        <w:pStyle w:val="ListParagraph"/>
+        <w:numPr>
+          <w:ilvl w:val="0"/>
+          <w:numId w:val="19"/>
+        </w:numPr>
+      </w:pPr>
+      <w:r>
+        <w:rPr>
+          <w:b/>
+          <w:bCs/>
+        </w:rPr>
+        <w:t>Account Management</w:t>
+      </w:r>
+      <w:r>
+        <w:t xml:space="preserve">: Users can update their own password or BU at any time. </w:t>
+      </w:r>
+    </w:p>
+    <w:p>
+      <w:pPr>
+        <w:pStyle w:val="ListParagraph"/>
+        <w:numPr>
+          <w:ilvl w:val="0"/>
+          <w:numId w:val="19"/>
+        </w:numPr>
+      </w:pPr>
+      <w:r>
+        <w:rPr>
+          <w:b/>
+          <w:bCs/>
+        </w:rPr>
+        <w:t>App Selection &amp; SSO</w:t>
+      </w:r>
+      <w:r>
+        <w:t>: User clicks an app; the Hub generates a secure token and redirects to the target app.</w:t>
+      </w:r>
+      <w:r>
+        <w:t xml:space="preserve"> </w:t>
+      </w:r>
+    </w:p>
+    <w:p>
+      <w:pPr>
+        <w:pStyle w:val="Heading1"/>
+        <w:rPr>
+          <w:rFonts w:asciiTheme="minorHAnsi" w:eastAsiaTheme="minorEastAsia" w:hAnsiTheme="minorHAnsi" w:cstheme="minorBidi"/>
+          <w:color w:val="auto"/>
+          <w:sz w:val="22"/>
+          <w:szCs w:val="22"/>
+        </w:rPr>
+      </w:pPr>
     </w:p>
     <w:p>
       <w:pPr>
@@ -418,9 +594,9 @@
       </w:tblPr>
       <w:tblGrid>
         <w:gridCol w:w="710"/>
-        <w:gridCol w:w="1888"/>
-        <w:gridCol w:w="3613"/>
-        <w:gridCol w:w="2879"/>
+        <w:gridCol w:w="1822"/>
+        <w:gridCol w:w="3445"/>
+        <w:gridCol w:w="3113"/>
       </w:tblGrid>
       <w:tr>
         <w:trPr>
@@ -446,12 +622,6 @@
             <w:hideMark/>
           </w:tcPr>
           <w:p>
-            <w:pPr>
-              <w:rPr>
-                <w:b/>
-                <w:bCs/>
-              </w:rPr>
-            </w:pPr>
             <w:r>
               <w:rPr>
                 <w:b/>
@@ -480,12 +650,6 @@
             <w:hideMark/>
           </w:tcPr>
           <w:p>
-            <w:pPr>
-              <w:rPr>
-                <w:b/>
-                <w:bCs/>
-              </w:rPr>
-            </w:pPr>
             <w:r>
               <w:rPr>
                 <w:b/>
@@ -514,12 +678,6 @@
             <w:hideMark/>
           </w:tcPr>
           <w:p>
-            <w:pPr>
-              <w:rPr>
-                <w:b/>
-                <w:bCs/>
-              </w:rPr>
-            </w:pPr>
             <w:r>
               <w:rPr>
                 <w:b/>
@@ -548,12 +706,6 @@
             <w:hideMark/>
           </w:tcPr>
           <w:p>
-            <w:pPr>
-              <w:rPr>
-                <w:b/>
-                <w:bCs/>
-              </w:rPr>
-            </w:pPr>
             <w:r>
               <w:rPr>
                 <w:b/>
@@ -566,7 +718,6 @@
       </w:tr>
       <w:tr>
         <w:trPr>
-          <w:tblHeader/>
           <w:tblCellSpacing w:w="15" w:type="dxa"/>
         </w:trPr>
         <w:tc>
@@ -588,17 +739,7 @@
             <w:hideMark/>
           </w:tcPr>
           <w:p>
-            <w:pPr>
-              <w:rPr>
-                <w:b/>
-                <w:bCs/>
-              </w:rPr>
-            </w:pPr>
             <w:r>
-              <w:rPr>
-                <w:b/>
-                <w:bCs/>
-              </w:rPr>
               <w:t>1</w:t>
             </w:r>
           </w:p>
@@ -622,17 +763,7 @@
             <w:hideMark/>
           </w:tcPr>
           <w:p>
-            <w:pPr>
-              <w:rPr>
-                <w:b/>
-                <w:bCs/>
-              </w:rPr>
-            </w:pPr>
             <w:r>
-              <w:rPr>
-                <w:b/>
-                <w:bCs/>
-              </w:rPr>
               <w:t>Identity</w:t>
             </w:r>
           </w:p>
@@ -656,18 +787,8 @@
             <w:hideMark/>
           </w:tcPr>
           <w:p>
-            <w:pPr>
-              <w:rPr>
-                <w:b/>
-                <w:bCs/>
-              </w:rPr>
-            </w:pPr>
             <w:r>
-              <w:rPr>
-                <w:b/>
-                <w:bCs/>
-              </w:rPr>
-              <w:t>As a user, I want to register and log in so that I can access my work tools securely.</w:t>
+              <w:t xml:space="preserve">As a user, I want to register and log in so that I can access my work tools securely. </w:t>
             </w:r>
           </w:p>
         </w:tc>
@@ -690,142 +811,45 @@
             <w:hideMark/>
           </w:tcPr>
           <w:p>
-            <w:pPr>
-              <w:rPr>
-                <w:b/>
-                <w:bCs/>
-              </w:rPr>
-            </w:pPr>
             <w:r>
-              <w:rPr>
-                <w:b/>
-                <w:bCs/>
-              </w:rPr>
-              <w:t xml:space="preserve">• User can register with company </w:t>
+              <w:t xml:space="preserve">• User can register with company email. </w:t>
             </w:r>
-            <w:proofErr w:type="gramStart"/>
-            <w:r>
-              <w:rPr>
-                <w:b/>
-                <w:bCs/>
-              </w:rPr>
-              <w:t>email .</w:t>
-            </w:r>
-            <w:proofErr w:type="gramEnd"/>
           </w:p>
           <w:p>
-            <w:pPr>
-              <w:rPr>
-                <w:b/>
-                <w:bCs/>
-              </w:rPr>
-            </w:pPr>
             <w:r>
-              <w:rPr>
-                <w:b/>
-                <w:bCs/>
-              </w:rPr>
               <w:br/>
             </w:r>
           </w:p>
           <w:p>
-            <w:pPr>
-              <w:rPr>
-                <w:b/>
-                <w:bCs/>
-              </w:rPr>
-            </w:pPr>
             <w:r>
-              <w:rPr>
-                <w:b/>
-                <w:bCs/>
-              </w:rPr>
-              <w:t xml:space="preserve">• Mandatory "Retype Password" </w:t>
+              <w:t xml:space="preserve">• Mandatory "Retype Password" field. </w:t>
             </w:r>
-            <w:proofErr w:type="gramStart"/>
-            <w:r>
-              <w:rPr>
-                <w:b/>
-                <w:bCs/>
-              </w:rPr>
-              <w:t>field .</w:t>
-            </w:r>
-            <w:proofErr w:type="gramEnd"/>
           </w:p>
           <w:p>
-            <w:pPr>
-              <w:rPr>
-                <w:b/>
-                <w:bCs/>
-              </w:rPr>
-            </w:pPr>
             <w:r>
-              <w:rPr>
-                <w:b/>
-                <w:bCs/>
-              </w:rPr>
               <w:br/>
             </w:r>
           </w:p>
           <w:p>
-            <w:pPr>
-              <w:rPr>
-                <w:b/>
-                <w:bCs/>
-              </w:rPr>
-            </w:pPr>
             <w:r>
-              <w:rPr>
-                <w:b/>
-                <w:bCs/>
-              </w:rPr>
-              <w:t>• Dropdown to select Business Unit (BU</w:t>
+              <w:t xml:space="preserve">• Dropdown to select Business Unit (BU). </w:t>
             </w:r>
-            <w:proofErr w:type="gramStart"/>
-            <w:r>
-              <w:rPr>
-                <w:b/>
-                <w:bCs/>
-              </w:rPr>
-              <w:t>) .</w:t>
-            </w:r>
-            <w:proofErr w:type="gramEnd"/>
           </w:p>
           <w:p>
-            <w:pPr>
-              <w:rPr>
-                <w:b/>
-                <w:bCs/>
-              </w:rPr>
-            </w:pPr>
             <w:r>
-              <w:rPr>
-                <w:b/>
-                <w:bCs/>
-              </w:rPr>
               <w:br/>
             </w:r>
           </w:p>
           <w:p>
-            <w:pPr>
-              <w:rPr>
-                <w:b/>
-                <w:bCs/>
-              </w:rPr>
-            </w:pPr>
             <w:r>
-              <w:rPr>
-                <w:b/>
-                <w:bCs/>
-              </w:rPr>
-              <w:t>• System validates credentials.</w:t>
+              <w:lastRenderedPageBreak/>
+              <w:t xml:space="preserve">• System validates credentials. </w:t>
             </w:r>
           </w:p>
         </w:tc>
       </w:tr>
       <w:tr>
         <w:trPr>
-          <w:tblHeader/>
           <w:tblCellSpacing w:w="15" w:type="dxa"/>
         </w:trPr>
         <w:tc>
@@ -847,17 +871,7 @@
             <w:hideMark/>
           </w:tcPr>
           <w:p>
-            <w:pPr>
-              <w:rPr>
-                <w:b/>
-                <w:bCs/>
-              </w:rPr>
-            </w:pPr>
             <w:r>
-              <w:rPr>
-                <w:b/>
-                <w:bCs/>
-              </w:rPr>
               <w:lastRenderedPageBreak/>
               <w:t>2</w:t>
             </w:r>
@@ -882,17 +896,435 @@
             <w:hideMark/>
           </w:tcPr>
           <w:p>
-            <w:pPr>
-              <w:rPr>
-                <w:b/>
-                <w:bCs/>
-              </w:rPr>
-            </w:pPr>
+            <w:r>
+              <w:t>Password Security</w:t>
+            </w:r>
+          </w:p>
+        </w:tc>
+        <w:tc>
+          <w:tcPr>
+            <w:tcW w:w="0" w:type="auto"/>
+            <w:tcBorders>
+              <w:top w:val="single" w:sz="6" w:space="0" w:color="auto"/>
+              <w:left w:val="single" w:sz="6" w:space="0" w:color="auto"/>
+              <w:bottom w:val="single" w:sz="6" w:space="0" w:color="auto"/>
+              <w:right w:val="single" w:sz="6" w:space="0" w:color="auto"/>
+            </w:tcBorders>
+            <w:tcMar>
+              <w:top w:w="120" w:type="dxa"/>
+              <w:left w:w="180" w:type="dxa"/>
+              <w:bottom w:w="120" w:type="dxa"/>
+              <w:right w:w="180" w:type="dxa"/>
+            </w:tcMar>
+            <w:vAlign w:val="center"/>
+            <w:hideMark/>
+          </w:tcPr>
+          <w:p>
+            <w:r>
+              <w:t>As a user, I want a high-security password policy so that my account is protected from unauthorized access.</w:t>
+            </w:r>
+          </w:p>
+        </w:tc>
+        <w:tc>
+          <w:tcPr>
+            <w:tcW w:w="0" w:type="auto"/>
+            <w:tcBorders>
+              <w:top w:val="single" w:sz="6" w:space="0" w:color="auto"/>
+              <w:left w:val="single" w:sz="6" w:space="0" w:color="auto"/>
+              <w:bottom w:val="single" w:sz="6" w:space="0" w:color="auto"/>
+              <w:right w:val="single" w:sz="6" w:space="0" w:color="auto"/>
+            </w:tcBorders>
+            <w:tcMar>
+              <w:top w:w="120" w:type="dxa"/>
+              <w:left w:w="180" w:type="dxa"/>
+              <w:bottom w:w="120" w:type="dxa"/>
+              <w:right w:w="180" w:type="dxa"/>
+            </w:tcMar>
+            <w:vAlign w:val="center"/>
+            <w:hideMark/>
+          </w:tcPr>
+          <w:p>
+            <w:r>
+              <w:t xml:space="preserve">• </w:t>
+            </w:r>
             <w:r>
               <w:rPr>
                 <w:b/>
                 <w:bCs/>
               </w:rPr>
+              <w:t>Complexity:</w:t>
+            </w:r>
+            <w:r>
+              <w:t xml:space="preserve"> Minimum 6 characters (default), including uppercase, lowercase, numbers, and symbols.</w:t>
+            </w:r>
+          </w:p>
+          <w:p>
+            <w:r>
+              <w:br/>
+            </w:r>
+          </w:p>
+          <w:p>
+            <w:r>
+              <w:t xml:space="preserve">• </w:t>
+            </w:r>
+            <w:r>
+              <w:rPr>
+                <w:b/>
+                <w:bCs/>
+              </w:rPr>
+              <w:t>No Reuse:</w:t>
+            </w:r>
+            <w:r>
+              <w:t xml:space="preserve"> System prevents reuse of the last $X$ passwords based on policy.</w:t>
+            </w:r>
+          </w:p>
+        </w:tc>
+      </w:tr>
+      <w:tr>
+        <w:trPr>
+          <w:tblCellSpacing w:w="15" w:type="dxa"/>
+        </w:trPr>
+        <w:tc>
+          <w:tcPr>
+            <w:tcW w:w="0" w:type="auto"/>
+            <w:tcBorders>
+              <w:top w:val="single" w:sz="6" w:space="0" w:color="auto"/>
+              <w:left w:val="single" w:sz="6" w:space="0" w:color="auto"/>
+              <w:bottom w:val="single" w:sz="6" w:space="0" w:color="auto"/>
+              <w:right w:val="single" w:sz="6" w:space="0" w:color="auto"/>
+            </w:tcBorders>
+            <w:tcMar>
+              <w:top w:w="120" w:type="dxa"/>
+              <w:left w:w="180" w:type="dxa"/>
+              <w:bottom w:w="120" w:type="dxa"/>
+              <w:right w:w="180" w:type="dxa"/>
+            </w:tcMar>
+            <w:vAlign w:val="center"/>
+            <w:hideMark/>
+          </w:tcPr>
+          <w:p>
+            <w:r>
+              <w:t>3</w:t>
+            </w:r>
+          </w:p>
+        </w:tc>
+        <w:tc>
+          <w:tcPr>
+            <w:tcW w:w="0" w:type="auto"/>
+            <w:tcBorders>
+              <w:top w:val="single" w:sz="6" w:space="0" w:color="auto"/>
+              <w:left w:val="single" w:sz="6" w:space="0" w:color="auto"/>
+              <w:bottom w:val="single" w:sz="6" w:space="0" w:color="auto"/>
+              <w:right w:val="single" w:sz="6" w:space="0" w:color="auto"/>
+            </w:tcBorders>
+            <w:tcMar>
+              <w:top w:w="120" w:type="dxa"/>
+              <w:left w:w="180" w:type="dxa"/>
+              <w:bottom w:w="120" w:type="dxa"/>
+              <w:right w:w="180" w:type="dxa"/>
+            </w:tcMar>
+            <w:vAlign w:val="center"/>
+            <w:hideMark/>
+          </w:tcPr>
+          <w:p>
+            <w:r>
+              <w:t>Brute-force Protection</w:t>
+            </w:r>
+          </w:p>
+        </w:tc>
+        <w:tc>
+          <w:tcPr>
+            <w:tcW w:w="0" w:type="auto"/>
+            <w:tcBorders>
+              <w:top w:val="single" w:sz="6" w:space="0" w:color="auto"/>
+              <w:left w:val="single" w:sz="6" w:space="0" w:color="auto"/>
+              <w:bottom w:val="single" w:sz="6" w:space="0" w:color="auto"/>
+              <w:right w:val="single" w:sz="6" w:space="0" w:color="auto"/>
+            </w:tcBorders>
+            <w:tcMar>
+              <w:top w:w="120" w:type="dxa"/>
+              <w:left w:w="180" w:type="dxa"/>
+              <w:bottom w:w="120" w:type="dxa"/>
+              <w:right w:w="180" w:type="dxa"/>
+            </w:tcMar>
+            <w:vAlign w:val="center"/>
+            <w:hideMark/>
+          </w:tcPr>
+          <w:p>
+            <w:r>
+              <w:t>As a security-conscious user, I want my account to lock after multiple failed attempts to prevent hacking.</w:t>
+            </w:r>
+          </w:p>
+        </w:tc>
+        <w:tc>
+          <w:tcPr>
+            <w:tcW w:w="0" w:type="auto"/>
+            <w:tcBorders>
+              <w:top w:val="single" w:sz="6" w:space="0" w:color="auto"/>
+              <w:left w:val="single" w:sz="6" w:space="0" w:color="auto"/>
+              <w:bottom w:val="single" w:sz="6" w:space="0" w:color="auto"/>
+              <w:right w:val="single" w:sz="6" w:space="0" w:color="auto"/>
+            </w:tcBorders>
+            <w:tcMar>
+              <w:top w:w="120" w:type="dxa"/>
+              <w:left w:w="180" w:type="dxa"/>
+              <w:bottom w:w="120" w:type="dxa"/>
+              <w:right w:w="180" w:type="dxa"/>
+            </w:tcMar>
+            <w:vAlign w:val="center"/>
+            <w:hideMark/>
+          </w:tcPr>
+          <w:p>
+            <w:r>
+              <w:t xml:space="preserve">• </w:t>
+            </w:r>
+            <w:r>
+              <w:rPr>
+                <w:b/>
+                <w:bCs/>
+              </w:rPr>
+              <w:t>Account Lockout:</w:t>
+            </w:r>
+            <w:r>
+              <w:t xml:space="preserve"> Account locks after $X$ failed attempts (default: 5).</w:t>
+            </w:r>
+          </w:p>
+          <w:p>
+            <w:r>
+              <w:br/>
+            </w:r>
+          </w:p>
+          <w:p>
+            <w:r>
+              <w:t xml:space="preserve">• </w:t>
+            </w:r>
+            <w:r>
+              <w:rPr>
+                <w:b/>
+                <w:bCs/>
+              </w:rPr>
+              <w:t>Recovery:</w:t>
+            </w:r>
+            <w:r>
+              <w:t xml:space="preserve"> Auto-unlock after 30 mins or manual unlock by Admin.</w:t>
+            </w:r>
+          </w:p>
+        </w:tc>
+      </w:tr>
+      <w:tr>
+        <w:trPr>
+          <w:tblCellSpacing w:w="15" w:type="dxa"/>
+        </w:trPr>
+        <w:tc>
+          <w:tcPr>
+            <w:tcW w:w="0" w:type="auto"/>
+            <w:tcBorders>
+              <w:top w:val="single" w:sz="6" w:space="0" w:color="auto"/>
+              <w:left w:val="single" w:sz="6" w:space="0" w:color="auto"/>
+              <w:bottom w:val="single" w:sz="6" w:space="0" w:color="auto"/>
+              <w:right w:val="single" w:sz="6" w:space="0" w:color="auto"/>
+            </w:tcBorders>
+            <w:tcMar>
+              <w:top w:w="120" w:type="dxa"/>
+              <w:left w:w="180" w:type="dxa"/>
+              <w:bottom w:w="120" w:type="dxa"/>
+              <w:right w:w="180" w:type="dxa"/>
+            </w:tcMar>
+            <w:vAlign w:val="center"/>
+            <w:hideMark/>
+          </w:tcPr>
+          <w:p>
+            <w:r>
+              <w:t>4</w:t>
+            </w:r>
+          </w:p>
+        </w:tc>
+        <w:tc>
+          <w:tcPr>
+            <w:tcW w:w="0" w:type="auto"/>
+            <w:tcBorders>
+              <w:top w:val="single" w:sz="6" w:space="0" w:color="auto"/>
+              <w:left w:val="single" w:sz="6" w:space="0" w:color="auto"/>
+              <w:bottom w:val="single" w:sz="6" w:space="0" w:color="auto"/>
+              <w:right w:val="single" w:sz="6" w:space="0" w:color="auto"/>
+            </w:tcBorders>
+            <w:tcMar>
+              <w:top w:w="120" w:type="dxa"/>
+              <w:left w:w="180" w:type="dxa"/>
+              <w:bottom w:w="120" w:type="dxa"/>
+              <w:right w:w="180" w:type="dxa"/>
+            </w:tcMar>
+            <w:vAlign w:val="center"/>
+            <w:hideMark/>
+          </w:tcPr>
+          <w:p>
+            <w:r>
+              <w:t>Password Policy (Admin)</w:t>
+            </w:r>
+          </w:p>
+        </w:tc>
+        <w:tc>
+          <w:tcPr>
+            <w:tcW w:w="0" w:type="auto"/>
+            <w:tcBorders>
+              <w:top w:val="single" w:sz="6" w:space="0" w:color="auto"/>
+              <w:left w:val="single" w:sz="6" w:space="0" w:color="auto"/>
+              <w:bottom w:val="single" w:sz="6" w:space="0" w:color="auto"/>
+              <w:right w:val="single" w:sz="6" w:space="0" w:color="auto"/>
+            </w:tcBorders>
+            <w:tcMar>
+              <w:top w:w="120" w:type="dxa"/>
+              <w:left w:w="180" w:type="dxa"/>
+              <w:bottom w:w="120" w:type="dxa"/>
+              <w:right w:w="180" w:type="dxa"/>
+            </w:tcMar>
+            <w:vAlign w:val="center"/>
+            <w:hideMark/>
+          </w:tcPr>
+          <w:p>
+            <w:r>
+              <w:rPr>
+                <w:b/>
+                <w:bCs/>
+              </w:rPr>
+              <w:t>As an Admin, I want to configure password and lockout settings so that I can adjust security levels based on company policy.</w:t>
+            </w:r>
+          </w:p>
+        </w:tc>
+        <w:tc>
+          <w:tcPr>
+            <w:tcW w:w="0" w:type="auto"/>
+            <w:tcBorders>
+              <w:top w:val="single" w:sz="6" w:space="0" w:color="auto"/>
+              <w:left w:val="single" w:sz="6" w:space="0" w:color="auto"/>
+              <w:bottom w:val="single" w:sz="6" w:space="0" w:color="auto"/>
+              <w:right w:val="single" w:sz="6" w:space="0" w:color="auto"/>
+            </w:tcBorders>
+            <w:tcMar>
+              <w:top w:w="120" w:type="dxa"/>
+              <w:left w:w="180" w:type="dxa"/>
+              <w:bottom w:w="120" w:type="dxa"/>
+              <w:right w:w="180" w:type="dxa"/>
+            </w:tcMar>
+            <w:vAlign w:val="center"/>
+            <w:hideMark/>
+          </w:tcPr>
+          <w:p>
+            <w:r>
+              <w:t xml:space="preserve">• UI to set </w:t>
+            </w:r>
+            <w:r>
+              <w:rPr>
+                <w:b/>
+                <w:bCs/>
+              </w:rPr>
+              <w:t>Min Password Length</w:t>
+            </w:r>
+            <w:r>
+              <w:t xml:space="preserve"> and </w:t>
+            </w:r>
+            <w:r>
+              <w:rPr>
+                <w:b/>
+                <w:bCs/>
+              </w:rPr>
+              <w:t>Complexity toggles</w:t>
+            </w:r>
+            <w:r>
+              <w:t>.</w:t>
+            </w:r>
+          </w:p>
+          <w:p>
+            <w:r>
+              <w:br/>
+            </w:r>
+          </w:p>
+          <w:p>
+            <w:r>
+              <w:t xml:space="preserve">• Field to set </w:t>
+            </w:r>
+            <w:r>
+              <w:rPr>
+                <w:b/>
+                <w:bCs/>
+              </w:rPr>
+              <w:t>Password History count</w:t>
+            </w:r>
+            <w:r>
+              <w:t xml:space="preserve"> (e.g., last 5).</w:t>
+            </w:r>
+          </w:p>
+          <w:p>
+            <w:r>
+              <w:br/>
+            </w:r>
+          </w:p>
+          <w:p>
+            <w:r>
+              <w:t xml:space="preserve">• Field to set </w:t>
+            </w:r>
+            <w:r>
+              <w:rPr>
+                <w:b/>
+                <w:bCs/>
+              </w:rPr>
+              <w:t>Max Login Attempts</w:t>
+            </w:r>
+            <w:r>
+              <w:t xml:space="preserve"> before lockout.</w:t>
+            </w:r>
+          </w:p>
+        </w:tc>
+      </w:tr>
+      <w:tr>
+        <w:trPr>
+          <w:tblCellSpacing w:w="15" w:type="dxa"/>
+        </w:trPr>
+        <w:tc>
+          <w:tcPr>
+            <w:tcW w:w="0" w:type="auto"/>
+            <w:tcBorders>
+              <w:top w:val="single" w:sz="6" w:space="0" w:color="auto"/>
+              <w:left w:val="single" w:sz="6" w:space="0" w:color="auto"/>
+              <w:bottom w:val="single" w:sz="6" w:space="0" w:color="auto"/>
+              <w:right w:val="single" w:sz="6" w:space="0" w:color="auto"/>
+            </w:tcBorders>
+            <w:tcMar>
+              <w:top w:w="120" w:type="dxa"/>
+              <w:left w:w="180" w:type="dxa"/>
+              <w:bottom w:w="120" w:type="dxa"/>
+              <w:right w:w="180" w:type="dxa"/>
+            </w:tcMar>
+            <w:vAlign w:val="center"/>
+            <w:hideMark/>
+          </w:tcPr>
+          <w:p>
+            <w:r>
+              <w:lastRenderedPageBreak/>
+              <w:t>5</w:t>
+            </w:r>
+          </w:p>
+        </w:tc>
+        <w:tc>
+          <w:tcPr>
+            <w:tcW w:w="0" w:type="auto"/>
+            <w:tcBorders>
+              <w:top w:val="single" w:sz="6" w:space="0" w:color="auto"/>
+              <w:left w:val="single" w:sz="6" w:space="0" w:color="auto"/>
+              <w:bottom w:val="single" w:sz="6" w:space="0" w:color="auto"/>
+              <w:right w:val="single" w:sz="6" w:space="0" w:color="auto"/>
+            </w:tcBorders>
+            <w:tcMar>
+              <w:top w:w="120" w:type="dxa"/>
+              <w:left w:w="180" w:type="dxa"/>
+              <w:bottom w:w="120" w:type="dxa"/>
+              <w:right w:w="180" w:type="dxa"/>
+            </w:tcMar>
+            <w:vAlign w:val="center"/>
+            <w:hideMark/>
+          </w:tcPr>
+          <w:p>
+            <w:r>
               <w:t>Domain Validation</w:t>
             </w:r>
           </w:p>
@@ -916,18 +1348,8 @@
             <w:hideMark/>
           </w:tcPr>
           <w:p>
-            <w:pPr>
-              <w:rPr>
-                <w:b/>
-                <w:bCs/>
-              </w:rPr>
-            </w:pPr>
             <w:r>
-              <w:rPr>
-                <w:b/>
-                <w:bCs/>
-              </w:rPr>
-              <w:t>As an Admin, I want to manage a whitelist of domains so that only authorized company emails can register.</w:t>
+              <w:t xml:space="preserve">As an Admin, I want to manage a whitelist of domains so that only authorized company emails can register. </w:t>
             </w:r>
           </w:p>
         </w:tc>
@@ -950,103 +1372,34 @@
             <w:hideMark/>
           </w:tcPr>
           <w:p>
-            <w:pPr>
-              <w:rPr>
-                <w:b/>
-                <w:bCs/>
-              </w:rPr>
-            </w:pPr>
             <w:r>
-              <w:rPr>
-                <w:b/>
-                <w:bCs/>
-              </w:rPr>
-              <w:t>• Admin CRUD for "Allowed Domains</w:t>
+              <w:t xml:space="preserve">• Admin CRUD for "Allowed Domains". </w:t>
             </w:r>
-            <w:proofErr w:type="gramStart"/>
-            <w:r>
-              <w:rPr>
-                <w:b/>
-                <w:bCs/>
-              </w:rPr>
-              <w:t>" .</w:t>
-            </w:r>
-            <w:proofErr w:type="gramEnd"/>
           </w:p>
           <w:p>
-            <w:pPr>
-              <w:rPr>
-                <w:b/>
-                <w:bCs/>
-              </w:rPr>
-            </w:pPr>
             <w:r>
-              <w:rPr>
-                <w:b/>
-                <w:bCs/>
-              </w:rPr>
               <w:br/>
             </w:r>
           </w:p>
           <w:p>
-            <w:pPr>
-              <w:rPr>
-                <w:b/>
-                <w:bCs/>
-              </w:rPr>
-            </w:pPr>
             <w:r>
-              <w:rPr>
-                <w:b/>
-                <w:bCs/>
-              </w:rPr>
-              <w:t xml:space="preserve">• System blocks unauthorized </w:t>
+              <w:t xml:space="preserve">• System blocks unauthorized domains. </w:t>
             </w:r>
-            <w:proofErr w:type="gramStart"/>
-            <w:r>
-              <w:rPr>
-                <w:b/>
-                <w:bCs/>
-              </w:rPr>
-              <w:t>domains .</w:t>
-            </w:r>
-            <w:proofErr w:type="gramEnd"/>
           </w:p>
           <w:p>
-            <w:pPr>
-              <w:rPr>
-                <w:b/>
-                <w:bCs/>
-              </w:rPr>
-            </w:pPr>
             <w:r>
-              <w:rPr>
-                <w:b/>
-                <w:bCs/>
-              </w:rPr>
               <w:br/>
             </w:r>
           </w:p>
           <w:p>
-            <w:pPr>
-              <w:rPr>
-                <w:b/>
-                <w:bCs/>
-              </w:rPr>
-            </w:pPr>
             <w:r>
-              <w:rPr>
-                <w:b/>
-                <w:bCs/>
-              </w:rPr>
-              <w:t>• Error message: "Email domain not authorized".</w:t>
+              <w:t xml:space="preserve">• Error message: "Email domain not authorized". </w:t>
             </w:r>
           </w:p>
         </w:tc>
       </w:tr>
       <w:tr>
         <w:trPr>
-          <w:tblHeader/>
           <w:tblCellSpacing w:w="15" w:type="dxa"/>
         </w:trPr>
         <w:tc>
@@ -1068,18 +1421,8 @@
             <w:hideMark/>
           </w:tcPr>
           <w:p>
-            <w:pPr>
-              <w:rPr>
-                <w:b/>
-                <w:bCs/>
-              </w:rPr>
-            </w:pPr>
             <w:r>
-              <w:rPr>
-                <w:b/>
-                <w:bCs/>
-              </w:rPr>
-              <w:t>3</w:t>
+              <w:t>6</w:t>
             </w:r>
           </w:p>
         </w:tc>
@@ -1102,17 +1445,7 @@
             <w:hideMark/>
           </w:tcPr>
           <w:p>
-            <w:pPr>
-              <w:rPr>
-                <w:b/>
-                <w:bCs/>
-              </w:rPr>
-            </w:pPr>
             <w:r>
-              <w:rPr>
-                <w:b/>
-                <w:bCs/>
-              </w:rPr>
               <w:t>Account Management</w:t>
             </w:r>
           </w:p>
@@ -1136,18 +1469,8 @@
             <w:hideMark/>
           </w:tcPr>
           <w:p>
-            <w:pPr>
-              <w:rPr>
-                <w:b/>
-                <w:bCs/>
-              </w:rPr>
-            </w:pPr>
             <w:r>
-              <w:rPr>
-                <w:b/>
-                <w:bCs/>
-              </w:rPr>
-              <w:t>As a user, I want to manage my profile so I can keep my BU and security credentials up to date.</w:t>
+              <w:t xml:space="preserve">As a user, I want to manage my profile so I can keep my BU and security credentials up to date. </w:t>
             </w:r>
           </w:p>
         </w:tc>
@@ -1170,103 +1493,34 @@
             <w:hideMark/>
           </w:tcPr>
           <w:p>
-            <w:pPr>
-              <w:rPr>
-                <w:b/>
-                <w:bCs/>
-              </w:rPr>
-            </w:pPr>
             <w:r>
-              <w:rPr>
-                <w:b/>
-                <w:bCs/>
-              </w:rPr>
-              <w:t xml:space="preserve">• Menu accessible to all logged-in </w:t>
+              <w:t xml:space="preserve">• Menu accessible to all logged-in users. </w:t>
             </w:r>
-            <w:proofErr w:type="gramStart"/>
-            <w:r>
-              <w:rPr>
-                <w:b/>
-                <w:bCs/>
-              </w:rPr>
-              <w:t>users .</w:t>
-            </w:r>
-            <w:proofErr w:type="gramEnd"/>
           </w:p>
           <w:p>
-            <w:pPr>
-              <w:rPr>
-                <w:b/>
-                <w:bCs/>
-              </w:rPr>
-            </w:pPr>
             <w:r>
-              <w:rPr>
-                <w:b/>
-                <w:bCs/>
-              </w:rPr>
               <w:br/>
             </w:r>
           </w:p>
           <w:p>
-            <w:pPr>
-              <w:rPr>
-                <w:b/>
-                <w:bCs/>
-              </w:rPr>
-            </w:pPr>
             <w:r>
-              <w:rPr>
-                <w:b/>
-                <w:bCs/>
-              </w:rPr>
-              <w:t xml:space="preserve">• Ability to change current </w:t>
+              <w:t xml:space="preserve">• Ability to change current password. </w:t>
             </w:r>
-            <w:proofErr w:type="gramStart"/>
-            <w:r>
-              <w:rPr>
-                <w:b/>
-                <w:bCs/>
-              </w:rPr>
-              <w:t>password .</w:t>
-            </w:r>
-            <w:proofErr w:type="gramEnd"/>
           </w:p>
           <w:p>
-            <w:pPr>
-              <w:rPr>
-                <w:b/>
-                <w:bCs/>
-              </w:rPr>
-            </w:pPr>
             <w:r>
-              <w:rPr>
-                <w:b/>
-                <w:bCs/>
-              </w:rPr>
               <w:br/>
             </w:r>
           </w:p>
           <w:p>
-            <w:pPr>
-              <w:rPr>
-                <w:b/>
-                <w:bCs/>
-              </w:rPr>
-            </w:pPr>
             <w:r>
-              <w:rPr>
-                <w:b/>
-                <w:bCs/>
-              </w:rPr>
-              <w:t>• Ability to update assigned Business Unit.</w:t>
+              <w:t xml:space="preserve">• Ability to update assigned Business Unit. </w:t>
             </w:r>
           </w:p>
         </w:tc>
       </w:tr>
       <w:tr>
         <w:trPr>
-          <w:tblHeader/>
           <w:tblCellSpacing w:w="15" w:type="dxa"/>
         </w:trPr>
         <w:tc>
@@ -1288,19 +1542,8 @@
             <w:hideMark/>
           </w:tcPr>
           <w:p>
-            <w:pPr>
-              <w:rPr>
-                <w:b/>
-                <w:bCs/>
-              </w:rPr>
-            </w:pPr>
             <w:r>
-              <w:rPr>
-                <w:b/>
-                <w:bCs/>
-              </w:rPr>
-              <w:lastRenderedPageBreak/>
-              <w:t>4</w:t>
+              <w:t>7</w:t>
             </w:r>
           </w:p>
         </w:tc>
@@ -1323,17 +1566,7 @@
             <w:hideMark/>
           </w:tcPr>
           <w:p>
-            <w:pPr>
-              <w:rPr>
-                <w:b/>
-                <w:bCs/>
-              </w:rPr>
-            </w:pPr>
             <w:r>
-              <w:rPr>
-                <w:b/>
-                <w:bCs/>
-              </w:rPr>
               <w:t>User Management</w:t>
             </w:r>
           </w:p>
@@ -1357,18 +1590,8 @@
             <w:hideMark/>
           </w:tcPr>
           <w:p>
-            <w:pPr>
-              <w:rPr>
-                <w:b/>
-                <w:bCs/>
-              </w:rPr>
-            </w:pPr>
             <w:r>
-              <w:rPr>
-                <w:b/>
-                <w:bCs/>
-              </w:rPr>
-              <w:t>As an Admin, I want to manually add, deactivate, and reset passwords for users so I can manage the user lifecycle.</w:t>
+              <w:t xml:space="preserve">As an Admin, I want to manually add, deactivate, reset passwords, and unlock accounts to manage the user lifecycle. </w:t>
             </w:r>
           </w:p>
         </w:tc>
@@ -1391,115 +1614,55 @@
             <w:hideMark/>
           </w:tcPr>
           <w:p>
-            <w:pPr>
-              <w:rPr>
-                <w:b/>
-                <w:bCs/>
-              </w:rPr>
-            </w:pPr>
+            <w:r>
+              <w:t xml:space="preserve">• Admin form for Email, Password, BU, and Role. </w:t>
+            </w:r>
+          </w:p>
+          <w:p>
+            <w:r>
+              <w:br/>
+            </w:r>
+          </w:p>
+          <w:p>
+            <w:r>
+              <w:lastRenderedPageBreak/>
+              <w:t xml:space="preserve">• "Deactivate" toggle for immediate revocation. </w:t>
+            </w:r>
+          </w:p>
+          <w:p>
+            <w:r>
+              <w:br/>
+            </w:r>
+          </w:p>
+          <w:p>
+            <w:r>
+              <w:t xml:space="preserve">• "Reset Password" and </w:t>
+            </w:r>
             <w:r>
               <w:rPr>
                 <w:b/>
                 <w:bCs/>
               </w:rPr>
-              <w:t>• Admin form to input Email, Password, BU, and Role.</w:t>
+              <w:t>"Unlock Account"</w:t>
+            </w:r>
+            <w:r>
+              <w:t xml:space="preserve"> buttons. </w:t>
             </w:r>
           </w:p>
           <w:p>
-            <w:pPr>
-              <w:rPr>
-                <w:b/>
-                <w:bCs/>
-              </w:rPr>
-            </w:pPr>
             <w:r>
-              <w:rPr>
-                <w:b/>
-                <w:bCs/>
-              </w:rPr>
               <w:br/>
             </w:r>
           </w:p>
           <w:p>
-            <w:pPr>
-              <w:rPr>
-                <w:b/>
-                <w:bCs/>
-              </w:rPr>
-            </w:pPr>
             <w:r>
-              <w:rPr>
-                <w:b/>
-                <w:bCs/>
-              </w:rPr>
-              <w:t>• "Deactivate" toggle to revoke user access immediately.</w:t>
-            </w:r>
-          </w:p>
-          <w:p>
-            <w:pPr>
-              <w:rPr>
-                <w:b/>
-                <w:bCs/>
-              </w:rPr>
-            </w:pPr>
-            <w:r>
-              <w:rPr>
-                <w:b/>
-                <w:bCs/>
-              </w:rPr>
-              <w:br/>
-            </w:r>
-          </w:p>
-          <w:p>
-            <w:pPr>
-              <w:rPr>
-                <w:b/>
-                <w:bCs/>
-              </w:rPr>
-            </w:pPr>
-            <w:r>
-              <w:rPr>
-                <w:b/>
-                <w:bCs/>
-              </w:rPr>
-              <w:t>• "Reset Password" button to set a temporary/new password.</w:t>
-            </w:r>
-          </w:p>
-          <w:p>
-            <w:pPr>
-              <w:rPr>
-                <w:b/>
-                <w:bCs/>
-              </w:rPr>
-            </w:pPr>
-            <w:r>
-              <w:rPr>
-                <w:b/>
-                <w:bCs/>
-              </w:rPr>
-              <w:br/>
-            </w:r>
-          </w:p>
-          <w:p>
-            <w:pPr>
-              <w:rPr>
-                <w:b/>
-                <w:bCs/>
-              </w:rPr>
-            </w:pPr>
-            <w:r>
-              <w:rPr>
-                <w:b/>
-                <w:bCs/>
-              </w:rPr>
-              <w:t>• Ability to toggle user roles (Admin/User).</w:t>
+              <w:t xml:space="preserve">• Toggle user roles (Admin/User). </w:t>
             </w:r>
           </w:p>
         </w:tc>
       </w:tr>
       <w:tr>
         <w:trPr>
-          <w:tblHeader/>
           <w:tblCellSpacing w:w="15" w:type="dxa"/>
         </w:trPr>
         <w:tc>
@@ -1521,18 +1684,9 @@
             <w:hideMark/>
           </w:tcPr>
           <w:p>
-            <w:pPr>
-              <w:rPr>
-                <w:b/>
-                <w:bCs/>
-              </w:rPr>
-            </w:pPr>
             <w:r>
-              <w:rPr>
-                <w:b/>
-                <w:bCs/>
-              </w:rPr>
-              <w:t>5</w:t>
+              <w:lastRenderedPageBreak/>
+              <w:t>8</w:t>
             </w:r>
           </w:p>
         </w:tc>
@@ -1555,18 +1709,8 @@
             <w:hideMark/>
           </w:tcPr>
           <w:p>
-            <w:pPr>
-              <w:rPr>
-                <w:b/>
-                <w:bCs/>
-              </w:rPr>
-            </w:pPr>
             <w:r>
-              <w:rPr>
-                <w:b/>
-                <w:bCs/>
-              </w:rPr>
-              <w:t>Password Policy</w:t>
+              <w:t>Password Expiry</w:t>
             </w:r>
           </w:p>
         </w:tc>
@@ -1589,18 +1733,8 @@
             <w:hideMark/>
           </w:tcPr>
           <w:p>
-            <w:pPr>
-              <w:rPr>
-                <w:b/>
-                <w:bCs/>
-              </w:rPr>
-            </w:pPr>
             <w:r>
-              <w:rPr>
-                <w:b/>
-                <w:bCs/>
-              </w:rPr>
-              <w:t>As an Admin, I want to enforce periodic password changes to maintain security.</w:t>
+              <w:t xml:space="preserve">As an Admin, I want to enforce periodic password changes to maintain security. </w:t>
             </w:r>
           </w:p>
         </w:tc>
@@ -1623,103 +1757,42 @@
             <w:hideMark/>
           </w:tcPr>
           <w:p>
-            <w:pPr>
-              <w:rPr>
-                <w:b/>
-                <w:bCs/>
-              </w:rPr>
-            </w:pPr>
             <w:r>
-              <w:rPr>
-                <w:b/>
-                <w:bCs/>
-              </w:rPr>
-              <w:t xml:space="preserve">• System tracks last password update </w:t>
+              <w:t xml:space="preserve">• System tracks last password update date. </w:t>
             </w:r>
-            <w:proofErr w:type="gramStart"/>
-            <w:r>
-              <w:rPr>
-                <w:b/>
-                <w:bCs/>
-              </w:rPr>
-              <w:t>date .</w:t>
-            </w:r>
-            <w:proofErr w:type="gramEnd"/>
           </w:p>
           <w:p>
-            <w:pPr>
-              <w:rPr>
-                <w:b/>
-                <w:bCs/>
-              </w:rPr>
-            </w:pPr>
             <w:r>
-              <w:rPr>
-                <w:b/>
-                <w:bCs/>
-              </w:rPr>
               <w:br/>
             </w:r>
           </w:p>
           <w:p>
-            <w:pPr>
-              <w:rPr>
-                <w:b/>
-                <w:bCs/>
-              </w:rPr>
-            </w:pPr>
             <w:r>
-              <w:rPr>
-                <w:b/>
-                <w:bCs/>
-              </w:rPr>
               <w:t xml:space="preserve">• Force password change prompt every X </w:t>
             </w:r>
             <w:proofErr w:type="gramStart"/>
             <w:r>
-              <w:rPr>
-                <w:b/>
-                <w:bCs/>
-              </w:rPr>
-              <w:t>months .</w:t>
+              <w:t>months</w:t>
             </w:r>
             <w:proofErr w:type="gramEnd"/>
+            <w:r>
+              <w:t xml:space="preserve">. </w:t>
+            </w:r>
           </w:p>
           <w:p>
-            <w:pPr>
-              <w:rPr>
-                <w:b/>
-                <w:bCs/>
-              </w:rPr>
-            </w:pPr>
             <w:r>
-              <w:rPr>
-                <w:b/>
-                <w:bCs/>
-              </w:rPr>
               <w:br/>
             </w:r>
           </w:p>
           <w:p>
-            <w:pPr>
-              <w:rPr>
-                <w:b/>
-                <w:bCs/>
-              </w:rPr>
-            </w:pPr>
             <w:r>
-              <w:rPr>
-                <w:b/>
-                <w:bCs/>
-              </w:rPr>
-              <w:t>• User blocked from dashboard until updated.</w:t>
+              <w:t xml:space="preserve">• User blocked from dashboard until updated. </w:t>
             </w:r>
           </w:p>
         </w:tc>
       </w:tr>
       <w:tr>
         <w:trPr>
-          <w:tblHeader/>
           <w:tblCellSpacing w:w="15" w:type="dxa"/>
         </w:trPr>
         <w:tc>
@@ -1741,19 +1814,8 @@
             <w:hideMark/>
           </w:tcPr>
           <w:p>
-            <w:pPr>
-              <w:rPr>
-                <w:b/>
-                <w:bCs/>
-              </w:rPr>
-            </w:pPr>
             <w:r>
-              <w:rPr>
-                <w:b/>
-                <w:bCs/>
-              </w:rPr>
-              <w:lastRenderedPageBreak/>
-              <w:t>6</w:t>
+              <w:t>9</w:t>
             </w:r>
           </w:p>
         </w:tc>
@@ -1776,17 +1838,7 @@
             <w:hideMark/>
           </w:tcPr>
           <w:p>
-            <w:pPr>
-              <w:rPr>
-                <w:b/>
-                <w:bCs/>
-              </w:rPr>
-            </w:pPr>
             <w:r>
-              <w:rPr>
-                <w:b/>
-                <w:bCs/>
-              </w:rPr>
               <w:t>Discovery</w:t>
             </w:r>
           </w:p>
@@ -1810,18 +1862,8 @@
             <w:hideMark/>
           </w:tcPr>
           <w:p>
-            <w:pPr>
-              <w:rPr>
-                <w:b/>
-                <w:bCs/>
-              </w:rPr>
-            </w:pPr>
             <w:r>
-              <w:rPr>
-                <w:b/>
-                <w:bCs/>
-              </w:rPr>
-              <w:t>As a user, I want to see a grid of application list so I can easily find the tool I need.</w:t>
+              <w:t xml:space="preserve">As a user, I want to see a grid of application list so I can easily find the tool I need. </w:t>
             </w:r>
           </w:p>
         </w:tc>
@@ -1844,64 +1886,24 @@
             <w:hideMark/>
           </w:tcPr>
           <w:p>
-            <w:pPr>
-              <w:rPr>
-                <w:b/>
-                <w:bCs/>
-              </w:rPr>
-            </w:pPr>
             <w:r>
-              <w:rPr>
-                <w:b/>
-                <w:bCs/>
-              </w:rPr>
-              <w:t xml:space="preserve">• Grid displays icon, name, and short </w:t>
+              <w:t xml:space="preserve">• Grid displays icon, name, and short description. </w:t>
             </w:r>
-            <w:proofErr w:type="gramStart"/>
-            <w:r>
-              <w:rPr>
-                <w:b/>
-                <w:bCs/>
-              </w:rPr>
-              <w:t>description .</w:t>
-            </w:r>
-            <w:proofErr w:type="gramEnd"/>
           </w:p>
           <w:p>
-            <w:pPr>
-              <w:rPr>
-                <w:b/>
-                <w:bCs/>
-              </w:rPr>
-            </w:pPr>
             <w:r>
-              <w:rPr>
-                <w:b/>
-                <w:bCs/>
-              </w:rPr>
               <w:br/>
             </w:r>
           </w:p>
           <w:p>
-            <w:pPr>
-              <w:rPr>
-                <w:b/>
-                <w:bCs/>
-              </w:rPr>
-            </w:pPr>
             <w:r>
-              <w:rPr>
-                <w:b/>
-                <w:bCs/>
-              </w:rPr>
-              <w:t>• Cards are clickable for redirection.</w:t>
+              <w:t xml:space="preserve">• Cards are clickable for redirection. </w:t>
             </w:r>
           </w:p>
         </w:tc>
       </w:tr>
       <w:tr>
         <w:trPr>
-          <w:tblHeader/>
           <w:tblCellSpacing w:w="15" w:type="dxa"/>
         </w:trPr>
         <w:tc>
@@ -1923,18 +1925,8 @@
             <w:hideMark/>
           </w:tcPr>
           <w:p>
-            <w:pPr>
-              <w:rPr>
-                <w:b/>
-                <w:bCs/>
-              </w:rPr>
-            </w:pPr>
             <w:r>
-              <w:rPr>
-                <w:b/>
-                <w:bCs/>
-              </w:rPr>
-              <w:t>7</w:t>
+              <w:t>10</w:t>
             </w:r>
           </w:p>
         </w:tc>
@@ -1957,18 +1949,12 @@
             <w:hideMark/>
           </w:tcPr>
           <w:p>
-            <w:pPr>
-              <w:rPr>
-                <w:b/>
-                <w:bCs/>
-              </w:rPr>
-            </w:pPr>
             <w:r>
-              <w:rPr>
-                <w:b/>
-                <w:bCs/>
-              </w:rPr>
-              <w:t>Apps Management</w:t>
+              <w:t xml:space="preserve">Apps </w:t>
+            </w:r>
+            <w:r>
+              <w:lastRenderedPageBreak/>
+              <w:t>Management</w:t>
             </w:r>
           </w:p>
         </w:tc>
@@ -1991,18 +1977,13 @@
             <w:hideMark/>
           </w:tcPr>
           <w:p>
-            <w:pPr>
-              <w:rPr>
-                <w:b/>
-                <w:bCs/>
-              </w:rPr>
-            </w:pPr>
             <w:r>
-              <w:rPr>
-                <w:b/>
-                <w:bCs/>
-              </w:rPr>
-              <w:t>As an admin, I want to manage applications and assign them to specific BUs.</w:t>
+              <w:lastRenderedPageBreak/>
+              <w:t xml:space="preserve">As an admin, I want to manage applications and assign them to </w:t>
+            </w:r>
+            <w:r>
+              <w:lastRenderedPageBreak/>
+              <w:t xml:space="preserve">specific BUs. </w:t>
             </w:r>
           </w:p>
         </w:tc>
@@ -2025,64 +2006,29 @@
             <w:hideMark/>
           </w:tcPr>
           <w:p>
-            <w:pPr>
-              <w:rPr>
-                <w:b/>
-                <w:bCs/>
-              </w:rPr>
-            </w:pPr>
             <w:r>
-              <w:rPr>
-                <w:b/>
-                <w:bCs/>
-              </w:rPr>
-              <w:t>• Fields for Name, Icon, Description, Link, and "Target BU</w:t>
+              <w:lastRenderedPageBreak/>
+              <w:t xml:space="preserve">• Fields for Name, Icon, Description, Link, and </w:t>
             </w:r>
-            <w:proofErr w:type="gramStart"/>
             <w:r>
-              <w:rPr>
-                <w:b/>
-                <w:bCs/>
-              </w:rPr>
-              <w:t>" .</w:t>
+              <w:lastRenderedPageBreak/>
+              <w:t xml:space="preserve">"Target BU". </w:t>
             </w:r>
-            <w:proofErr w:type="gramEnd"/>
           </w:p>
           <w:p>
-            <w:pPr>
-              <w:rPr>
-                <w:b/>
-                <w:bCs/>
-              </w:rPr>
-            </w:pPr>
             <w:r>
-              <w:rPr>
-                <w:b/>
-                <w:bCs/>
-              </w:rPr>
               <w:br/>
             </w:r>
           </w:p>
           <w:p>
-            <w:pPr>
-              <w:rPr>
-                <w:b/>
-                <w:bCs/>
-              </w:rPr>
-            </w:pPr>
             <w:r>
-              <w:rPr>
-                <w:b/>
-                <w:bCs/>
-              </w:rPr>
-              <w:t>• Option to assign an app to "All BUs" (Global).</w:t>
+              <w:t xml:space="preserve">• Option to assign an app to "All BUs" (Global). </w:t>
             </w:r>
           </w:p>
         </w:tc>
       </w:tr>
       <w:tr>
         <w:trPr>
-          <w:tblHeader/>
           <w:tblCellSpacing w:w="15" w:type="dxa"/>
         </w:trPr>
         <w:tc>
@@ -2104,18 +2050,9 @@
             <w:hideMark/>
           </w:tcPr>
           <w:p>
-            <w:pPr>
-              <w:rPr>
-                <w:b/>
-                <w:bCs/>
-              </w:rPr>
-            </w:pPr>
             <w:r>
-              <w:rPr>
-                <w:b/>
-                <w:bCs/>
-              </w:rPr>
-              <w:t>8</w:t>
+              <w:lastRenderedPageBreak/>
+              <w:t>11</w:t>
             </w:r>
           </w:p>
         </w:tc>
@@ -2138,17 +2075,7 @@
             <w:hideMark/>
           </w:tcPr>
           <w:p>
-            <w:pPr>
-              <w:rPr>
-                <w:b/>
-                <w:bCs/>
-              </w:rPr>
-            </w:pPr>
             <w:r>
-              <w:rPr>
-                <w:b/>
-                <w:bCs/>
-              </w:rPr>
               <w:t>SSO Hand-off</w:t>
             </w:r>
           </w:p>
@@ -2172,18 +2099,8 @@
             <w:hideMark/>
           </w:tcPr>
           <w:p>
-            <w:pPr>
-              <w:rPr>
-                <w:b/>
-                <w:bCs/>
-              </w:rPr>
-            </w:pPr>
             <w:r>
-              <w:rPr>
-                <w:b/>
-                <w:bCs/>
-              </w:rPr>
-              <w:t>As a user, I want to be automatically logged into target apps so I don't have to re-enter credentials.</w:t>
+              <w:t xml:space="preserve">As a user, I want to be automatically logged into target apps so I don't have to re-enter credentials. </w:t>
             </w:r>
           </w:p>
         </w:tc>
@@ -2206,57 +2123,18 @@
             <w:hideMark/>
           </w:tcPr>
           <w:p>
-            <w:pPr>
-              <w:rPr>
-                <w:b/>
-                <w:bCs/>
-              </w:rPr>
-            </w:pPr>
             <w:r>
-              <w:rPr>
-                <w:b/>
-                <w:bCs/>
-              </w:rPr>
-              <w:t xml:space="preserve">• Secure token generated on </w:t>
+              <w:t xml:space="preserve">• Secure token generated on click. </w:t>
             </w:r>
-            <w:proofErr w:type="gramStart"/>
-            <w:r>
-              <w:rPr>
-                <w:b/>
-                <w:bCs/>
-              </w:rPr>
-              <w:t>click .</w:t>
-            </w:r>
-            <w:proofErr w:type="gramEnd"/>
           </w:p>
           <w:p>
-            <w:pPr>
-              <w:rPr>
-                <w:b/>
-                <w:bCs/>
-              </w:rPr>
-            </w:pPr>
             <w:r>
-              <w:rPr>
-                <w:b/>
-                <w:bCs/>
-              </w:rPr>
               <w:br/>
             </w:r>
           </w:p>
           <w:p>
-            <w:pPr>
-              <w:rPr>
-                <w:b/>
-                <w:bCs/>
-              </w:rPr>
-            </w:pPr>
             <w:r>
-              <w:rPr>
-                <w:b/>
-                <w:bCs/>
-              </w:rPr>
-              <w:t>• Token passed securely to the target app link.</w:t>
+              <w:t xml:space="preserve">• Token passed securely to the target app link. </w:t>
             </w:r>
           </w:p>
         </w:tc>
@@ -2511,7 +2389,6 @@
           </w:tcPr>
           <w:p>
             <w:r>
-              <w:lastRenderedPageBreak/>
               <w:t>1</w:t>
             </w:r>
           </w:p>
@@ -2815,6 +2692,7 @@
           </w:tcPr>
           <w:p>
             <w:r>
+              <w:lastRenderedPageBreak/>
               <w:t>3</w:t>
             </w:r>
           </w:p>
@@ -3565,7 +3443,6 @@
                 <w:b/>
                 <w:bCs/>
               </w:rPr>
-              <w:lastRenderedPageBreak/>
               <w:t>3.1</w:t>
             </w:r>
           </w:p>
@@ -3663,6 +3540,188 @@
           </w:p>
         </w:tc>
       </w:tr>
+      <w:tr>
+        <w:trPr>
+          <w:tblCellSpacing w:w="15" w:type="dxa"/>
+        </w:trPr>
+        <w:tc>
+          <w:tcPr>
+            <w:tcW w:w="0" w:type="auto"/>
+            <w:tcBorders>
+              <w:top w:val="single" w:sz="6" w:space="0" w:color="auto"/>
+              <w:left w:val="single" w:sz="6" w:space="0" w:color="auto"/>
+              <w:bottom w:val="single" w:sz="6" w:space="0" w:color="auto"/>
+              <w:right w:val="single" w:sz="6" w:space="0" w:color="auto"/>
+            </w:tcBorders>
+            <w:tcMar>
+              <w:top w:w="120" w:type="dxa"/>
+              <w:left w:w="180" w:type="dxa"/>
+              <w:bottom w:w="120" w:type="dxa"/>
+              <w:right w:w="180" w:type="dxa"/>
+            </w:tcMar>
+            <w:vAlign w:val="center"/>
+          </w:tcPr>
+          <w:p>
+            <w:pPr>
+              <w:tabs>
+                <w:tab w:val="left" w:pos="2321"/>
+              </w:tabs>
+              <w:rPr>
+                <w:b/>
+                <w:bCs/>
+              </w:rPr>
+            </w:pPr>
+            <w:r>
+              <w:rPr>
+                <w:b/>
+                <w:bCs/>
+              </w:rPr>
+              <w:t>3.2</w:t>
+            </w:r>
+          </w:p>
+        </w:tc>
+        <w:tc>
+          <w:tcPr>
+            <w:tcW w:w="0" w:type="auto"/>
+            <w:tcBorders>
+              <w:top w:val="single" w:sz="6" w:space="0" w:color="auto"/>
+              <w:left w:val="single" w:sz="6" w:space="0" w:color="auto"/>
+              <w:bottom w:val="single" w:sz="6" w:space="0" w:color="auto"/>
+              <w:right w:val="single" w:sz="6" w:space="0" w:color="auto"/>
+            </w:tcBorders>
+            <w:tcMar>
+              <w:top w:w="120" w:type="dxa"/>
+              <w:left w:w="180" w:type="dxa"/>
+              <w:bottom w:w="120" w:type="dxa"/>
+              <w:right w:w="180" w:type="dxa"/>
+            </w:tcMar>
+            <w:vAlign w:val="center"/>
+          </w:tcPr>
+          <w:p>
+            <w:pPr>
+              <w:tabs>
+                <w:tab w:val="left" w:pos="2321"/>
+              </w:tabs>
+            </w:pPr>
+            <w:r>
+              <w:t>27 Feb 2026</w:t>
+            </w:r>
+          </w:p>
+        </w:tc>
+        <w:tc>
+          <w:tcPr>
+            <w:tcW w:w="0" w:type="auto"/>
+            <w:tcBorders>
+              <w:top w:val="single" w:sz="6" w:space="0" w:color="auto"/>
+              <w:left w:val="single" w:sz="6" w:space="0" w:color="auto"/>
+              <w:bottom w:val="single" w:sz="6" w:space="0" w:color="auto"/>
+              <w:right w:val="single" w:sz="6" w:space="0" w:color="auto"/>
+            </w:tcBorders>
+            <w:tcMar>
+              <w:top w:w="120" w:type="dxa"/>
+              <w:left w:w="180" w:type="dxa"/>
+              <w:bottom w:w="120" w:type="dxa"/>
+              <w:right w:w="180" w:type="dxa"/>
+            </w:tcMar>
+            <w:vAlign w:val="center"/>
+          </w:tcPr>
+          <w:p>
+            <w:pPr>
+              <w:tabs>
+                <w:tab w:val="left" w:pos="2321"/>
+              </w:tabs>
+            </w:pPr>
+            <w:r>
+              <w:t>Rian Dharmawan</w:t>
+            </w:r>
+          </w:p>
+        </w:tc>
+        <w:tc>
+          <w:tcPr>
+            <w:tcW w:w="0" w:type="auto"/>
+            <w:tcBorders>
+              <w:top w:val="single" w:sz="6" w:space="0" w:color="auto"/>
+              <w:left w:val="single" w:sz="6" w:space="0" w:color="auto"/>
+              <w:bottom w:val="single" w:sz="6" w:space="0" w:color="auto"/>
+              <w:right w:val="single" w:sz="6" w:space="0" w:color="auto"/>
+            </w:tcBorders>
+            <w:tcMar>
+              <w:top w:w="120" w:type="dxa"/>
+              <w:left w:w="180" w:type="dxa"/>
+              <w:bottom w:w="120" w:type="dxa"/>
+              <w:right w:w="180" w:type="dxa"/>
+            </w:tcMar>
+            <w:vAlign w:val="center"/>
+          </w:tcPr>
+          <w:p>
+            <w:pPr>
+              <w:tabs>
+                <w:tab w:val="left" w:pos="2321"/>
+              </w:tabs>
+              <w:rPr>
+                <w:b/>
+                <w:bCs/>
+              </w:rPr>
+            </w:pPr>
+            <w:r>
+              <w:rPr>
+                <w:b/>
+                <w:bCs/>
+              </w:rPr>
+              <w:t xml:space="preserve">Added </w:t>
+            </w:r>
+            <w:r>
+              <w:rPr>
+                <w:b/>
+                <w:bCs/>
+              </w:rPr>
+              <w:t xml:space="preserve">New Password Policy that configurable by </w:t>
+            </w:r>
+            <w:proofErr w:type="gramStart"/>
+            <w:r>
+              <w:rPr>
+                <w:b/>
+                <w:bCs/>
+              </w:rPr>
+              <w:t>admin :</w:t>
+            </w:r>
+            <w:proofErr w:type="gramEnd"/>
+          </w:p>
+          <w:p>
+            <w:pPr>
+              <w:tabs>
+                <w:tab w:val="left" w:pos="2321"/>
+              </w:tabs>
+              <w:rPr>
+                <w:b/>
+                <w:bCs/>
+              </w:rPr>
+            </w:pPr>
+            <w:r>
+              <w:rPr>
+                <w:b/>
+                <w:bCs/>
+              </w:rPr>
+              <w:t xml:space="preserve">Password Complexity, Password History (No reuse of last 5), and Account Lockout (5 </w:t>
+            </w:r>
+            <w:r>
+              <w:rPr>
+                <w:b/>
+                <w:bCs/>
+              </w:rPr>
+              <w:lastRenderedPageBreak/>
+              <w:t>attempts, 30 min wait/Admin unlock)</w:t>
+            </w:r>
+            <w:r>
+              <w:rPr>
+                <w:b/>
+                <w:bCs/>
+              </w:rPr>
+              <w:t xml:space="preserve"> </w:t>
+            </w:r>
+          </w:p>
+        </w:tc>
+      </w:tr>
     </w:tbl>
     <w:p>
       <w:pPr>
@@ -3968,6 +4027,119 @@
     </w:lvl>
   </w:abstractNum>
   <w:abstractNum w:abstractNumId="10" w15:restartNumberingAfterBreak="0">
+    <w:nsid w:val="07810972"/>
+    <w:multiLevelType w:val="hybridMultilevel"/>
+    <w:tmpl w:val="1310BD04"/>
+    <w:lvl w:ilvl="0" w:tplc="04090001">
+      <w:start w:val="1"/>
+      <w:numFmt w:val="bullet"/>
+      <w:lvlText w:val=""/>
+      <w:lvlJc w:val="left"/>
+      <w:pPr>
+        <w:ind w:left="720" w:hanging="360"/>
+      </w:pPr>
+      <w:rPr>
+        <w:rFonts w:ascii="Symbol" w:hAnsi="Symbol" w:hint="default"/>
+      </w:rPr>
+    </w:lvl>
+    <w:lvl w:ilvl="1" w:tplc="04090003" w:tentative="1">
+      <w:start w:val="1"/>
+      <w:numFmt w:val="bullet"/>
+      <w:lvlText w:val="o"/>
+      <w:lvlJc w:val="left"/>
+      <w:pPr>
+        <w:ind w:left="1440" w:hanging="360"/>
+      </w:pPr>
+      <w:rPr>
+        <w:rFonts w:ascii="Courier New" w:hAnsi="Courier New" w:cs="Courier New" w:hint="default"/>
+      </w:rPr>
+    </w:lvl>
+    <w:lvl w:ilvl="2" w:tplc="04090005" w:tentative="1">
+      <w:start w:val="1"/>
+      <w:numFmt w:val="bullet"/>
+      <w:lvlText w:val=""/>
+      <w:lvlJc w:val="left"/>
+      <w:pPr>
+        <w:ind w:left="2160" w:hanging="360"/>
+      </w:pPr>
+      <w:rPr>
+        <w:rFonts w:ascii="Wingdings" w:hAnsi="Wingdings" w:hint="default"/>
+      </w:rPr>
+    </w:lvl>
+    <w:lvl w:ilvl="3" w:tplc="04090001" w:tentative="1">
+      <w:start w:val="1"/>
+      <w:numFmt w:val="bullet"/>
+      <w:lvlText w:val=""/>
+      <w:lvlJc w:val="left"/>
+      <w:pPr>
+        <w:ind w:left="2880" w:hanging="360"/>
+      </w:pPr>
+      <w:rPr>
+        <w:rFonts w:ascii="Symbol" w:hAnsi="Symbol" w:hint="default"/>
+      </w:rPr>
+    </w:lvl>
+    <w:lvl w:ilvl="4" w:tplc="04090003" w:tentative="1">
+      <w:start w:val="1"/>
+      <w:numFmt w:val="bullet"/>
+      <w:lvlText w:val="o"/>
+      <w:lvlJc w:val="left"/>
+      <w:pPr>
+        <w:ind w:left="3600" w:hanging="360"/>
+      </w:pPr>
+      <w:rPr>
+        <w:rFonts w:ascii="Courier New" w:hAnsi="Courier New" w:cs="Courier New" w:hint="default"/>
+      </w:rPr>
+    </w:lvl>
+    <w:lvl w:ilvl="5" w:tplc="04090005" w:tentative="1">
+      <w:start w:val="1"/>
+      <w:numFmt w:val="bullet"/>
+      <w:lvlText w:val=""/>
+      <w:lvlJc w:val="left"/>
+      <w:pPr>
+        <w:ind w:left="4320" w:hanging="360"/>
+      </w:pPr>
+      <w:rPr>
+        <w:rFonts w:ascii="Wingdings" w:hAnsi="Wingdings" w:hint="default"/>
+      </w:rPr>
+    </w:lvl>
+    <w:lvl w:ilvl="6" w:tplc="04090001" w:tentative="1">
+      <w:start w:val="1"/>
+      <w:numFmt w:val="bullet"/>
+      <w:lvlText w:val=""/>
+      <w:lvlJc w:val="left"/>
+      <w:pPr>
+        <w:ind w:left="5040" w:hanging="360"/>
+      </w:pPr>
+      <w:rPr>
+        <w:rFonts w:ascii="Symbol" w:hAnsi="Symbol" w:hint="default"/>
+      </w:rPr>
+    </w:lvl>
+    <w:lvl w:ilvl="7" w:tplc="04090003" w:tentative="1">
+      <w:start w:val="1"/>
+      <w:numFmt w:val="bullet"/>
+      <w:lvlText w:val="o"/>
+      <w:lvlJc w:val="left"/>
+      <w:pPr>
+        <w:ind w:left="5760" w:hanging="360"/>
+      </w:pPr>
+      <w:rPr>
+        <w:rFonts w:ascii="Courier New" w:hAnsi="Courier New" w:cs="Courier New" w:hint="default"/>
+      </w:rPr>
+    </w:lvl>
+    <w:lvl w:ilvl="8" w:tplc="04090005" w:tentative="1">
+      <w:start w:val="1"/>
+      <w:numFmt w:val="bullet"/>
+      <w:lvlText w:val=""/>
+      <w:lvlJc w:val="left"/>
+      <w:pPr>
+        <w:ind w:left="6480" w:hanging="360"/>
+      </w:pPr>
+      <w:rPr>
+        <w:rFonts w:ascii="Wingdings" w:hAnsi="Wingdings" w:hint="default"/>
+      </w:rPr>
+    </w:lvl>
+  </w:abstractNum>
+  <w:abstractNum w:abstractNumId="11" w15:restartNumberingAfterBreak="0">
     <w:nsid w:val="0FEF6C6F"/>
     <w:multiLevelType w:val="hybridMultilevel"/>
     <w:tmpl w:val="50DC6972"/>
@@ -4079,7 +4251,7 @@
       </w:rPr>
     </w:lvl>
   </w:abstractNum>
-  <w:abstractNum w:abstractNumId="11" w15:restartNumberingAfterBreak="0">
+  <w:abstractNum w:abstractNumId="12" w15:restartNumberingAfterBreak="0">
     <w:nsid w:val="1DFE4334"/>
     <w:multiLevelType w:val="hybridMultilevel"/>
     <w:tmpl w:val="AF5266DC"/>
@@ -4192,7 +4364,7 @@
       </w:rPr>
     </w:lvl>
   </w:abstractNum>
-  <w:abstractNum w:abstractNumId="12" w15:restartNumberingAfterBreak="0">
+  <w:abstractNum w:abstractNumId="13" w15:restartNumberingAfterBreak="0">
     <w:nsid w:val="45824BC4"/>
     <w:multiLevelType w:val="hybridMultilevel"/>
     <w:tmpl w:val="AE24276A"/>
@@ -4304,7 +4476,7 @@
       </w:rPr>
     </w:lvl>
   </w:abstractNum>
-  <w:abstractNum w:abstractNumId="13" w15:restartNumberingAfterBreak="0">
+  <w:abstractNum w:abstractNumId="14" w15:restartNumberingAfterBreak="0">
     <w:nsid w:val="571578FF"/>
     <w:multiLevelType w:val="hybridMultilevel"/>
     <w:tmpl w:val="DF08AFC8"/>
@@ -4416,7 +4588,7 @@
       </w:rPr>
     </w:lvl>
   </w:abstractNum>
-  <w:abstractNum w:abstractNumId="14" w15:restartNumberingAfterBreak="0">
+  <w:abstractNum w:abstractNumId="15" w15:restartNumberingAfterBreak="0">
     <w:nsid w:val="5B23276A"/>
     <w:multiLevelType w:val="hybridMultilevel"/>
     <w:tmpl w:val="81948E54"/>
@@ -4529,7 +4701,120 @@
       </w:rPr>
     </w:lvl>
   </w:abstractNum>
-  <w:abstractNum w:abstractNumId="15" w15:restartNumberingAfterBreak="0">
+  <w:abstractNum w:abstractNumId="16" w15:restartNumberingAfterBreak="0">
+    <w:nsid w:val="5FF16E82"/>
+    <w:multiLevelType w:val="hybridMultilevel"/>
+    <w:tmpl w:val="96D280E2"/>
+    <w:lvl w:ilvl="0" w:tplc="04090001">
+      <w:start w:val="1"/>
+      <w:numFmt w:val="bullet"/>
+      <w:lvlText w:val=""/>
+      <w:lvlJc w:val="left"/>
+      <w:pPr>
+        <w:ind w:left="720" w:hanging="360"/>
+      </w:pPr>
+      <w:rPr>
+        <w:rFonts w:ascii="Symbol" w:hAnsi="Symbol" w:hint="default"/>
+      </w:rPr>
+    </w:lvl>
+    <w:lvl w:ilvl="1" w:tplc="04090003" w:tentative="1">
+      <w:start w:val="1"/>
+      <w:numFmt w:val="bullet"/>
+      <w:lvlText w:val="o"/>
+      <w:lvlJc w:val="left"/>
+      <w:pPr>
+        <w:ind w:left="1440" w:hanging="360"/>
+      </w:pPr>
+      <w:rPr>
+        <w:rFonts w:ascii="Courier New" w:hAnsi="Courier New" w:cs="Courier New" w:hint="default"/>
+      </w:rPr>
+    </w:lvl>
+    <w:lvl w:ilvl="2" w:tplc="04090005" w:tentative="1">
+      <w:start w:val="1"/>
+      <w:numFmt w:val="bullet"/>
+      <w:lvlText w:val=""/>
+      <w:lvlJc w:val="left"/>
+      <w:pPr>
+        <w:ind w:left="2160" w:hanging="360"/>
+      </w:pPr>
+      <w:rPr>
+        <w:rFonts w:ascii="Wingdings" w:hAnsi="Wingdings" w:hint="default"/>
+      </w:rPr>
+    </w:lvl>
+    <w:lvl w:ilvl="3" w:tplc="04090001" w:tentative="1">
+      <w:start w:val="1"/>
+      <w:numFmt w:val="bullet"/>
+      <w:lvlText w:val=""/>
+      <w:lvlJc w:val="left"/>
+      <w:pPr>
+        <w:ind w:left="2880" w:hanging="360"/>
+      </w:pPr>
+      <w:rPr>
+        <w:rFonts w:ascii="Symbol" w:hAnsi="Symbol" w:hint="default"/>
+      </w:rPr>
+    </w:lvl>
+    <w:lvl w:ilvl="4" w:tplc="04090003" w:tentative="1">
+      <w:start w:val="1"/>
+      <w:numFmt w:val="bullet"/>
+      <w:lvlText w:val="o"/>
+      <w:lvlJc w:val="left"/>
+      <w:pPr>
+        <w:ind w:left="3600" w:hanging="360"/>
+      </w:pPr>
+      <w:rPr>
+        <w:rFonts w:ascii="Courier New" w:hAnsi="Courier New" w:cs="Courier New" w:hint="default"/>
+      </w:rPr>
+    </w:lvl>
+    <w:lvl w:ilvl="5" w:tplc="04090005" w:tentative="1">
+      <w:start w:val="1"/>
+      <w:numFmt w:val="bullet"/>
+      <w:lvlText w:val=""/>
+      <w:lvlJc w:val="left"/>
+      <w:pPr>
+        <w:ind w:left="4320" w:hanging="360"/>
+      </w:pPr>
+      <w:rPr>
+        <w:rFonts w:ascii="Wingdings" w:hAnsi="Wingdings" w:hint="default"/>
+      </w:rPr>
+    </w:lvl>
+    <w:lvl w:ilvl="6" w:tplc="04090001" w:tentative="1">
+      <w:start w:val="1"/>
+      <w:numFmt w:val="bullet"/>
+      <w:lvlText w:val=""/>
+      <w:lvlJc w:val="left"/>
+      <w:pPr>
+        <w:ind w:left="5040" w:hanging="360"/>
+      </w:pPr>
+      <w:rPr>
+        <w:rFonts w:ascii="Symbol" w:hAnsi="Symbol" w:hint="default"/>
+      </w:rPr>
+    </w:lvl>
+    <w:lvl w:ilvl="7" w:tplc="04090003" w:tentative="1">
+      <w:start w:val="1"/>
+      <w:numFmt w:val="bullet"/>
+      <w:lvlText w:val="o"/>
+      <w:lvlJc w:val="left"/>
+      <w:pPr>
+        <w:ind w:left="5760" w:hanging="360"/>
+      </w:pPr>
+      <w:rPr>
+        <w:rFonts w:ascii="Courier New" w:hAnsi="Courier New" w:cs="Courier New" w:hint="default"/>
+      </w:rPr>
+    </w:lvl>
+    <w:lvl w:ilvl="8" w:tplc="04090005" w:tentative="1">
+      <w:start w:val="1"/>
+      <w:numFmt w:val="bullet"/>
+      <w:lvlText w:val=""/>
+      <w:lvlJc w:val="left"/>
+      <w:pPr>
+        <w:ind w:left="6480" w:hanging="360"/>
+      </w:pPr>
+      <w:rPr>
+        <w:rFonts w:ascii="Wingdings" w:hAnsi="Wingdings" w:hint="default"/>
+      </w:rPr>
+    </w:lvl>
+  </w:abstractNum>
+  <w:abstractNum w:abstractNumId="17" w15:restartNumberingAfterBreak="0">
     <w:nsid w:val="713E1ED6"/>
     <w:multiLevelType w:val="hybridMultilevel"/>
     <w:tmpl w:val="5A5018E0"/>
@@ -4642,7 +4927,7 @@
       </w:rPr>
     </w:lvl>
   </w:abstractNum>
-  <w:abstractNum w:abstractNumId="16" w15:restartNumberingAfterBreak="0">
+  <w:abstractNum w:abstractNumId="18" w15:restartNumberingAfterBreak="0">
     <w:nsid w:val="78C611A9"/>
     <w:multiLevelType w:val="hybridMultilevel"/>
     <w:tmpl w:val="4EE89DD6"/>
@@ -4782,28 +5067,34 @@
     <w:abstractNumId w:val="0"/>
   </w:num>
   <w:num w:numId="10" w16cid:durableId="133717574">
-    <w:abstractNumId w:val="15"/>
+    <w:abstractNumId w:val="17"/>
   </w:num>
   <w:num w:numId="11" w16cid:durableId="880366537">
-    <w:abstractNumId w:val="13"/>
+    <w:abstractNumId w:val="14"/>
   </w:num>
   <w:num w:numId="12" w16cid:durableId="248319005">
-    <w:abstractNumId w:val="16"/>
+    <w:abstractNumId w:val="18"/>
   </w:num>
   <w:num w:numId="13" w16cid:durableId="157699430">
-    <w:abstractNumId w:val="10"/>
+    <w:abstractNumId w:val="11"/>
   </w:num>
   <w:num w:numId="14" w16cid:durableId="1167672629">
-    <w:abstractNumId w:val="12"/>
+    <w:abstractNumId w:val="13"/>
   </w:num>
   <w:num w:numId="15" w16cid:durableId="1705211207">
     <w:abstractNumId w:val="9"/>
   </w:num>
   <w:num w:numId="16" w16cid:durableId="331103765">
-    <w:abstractNumId w:val="14"/>
+    <w:abstractNumId w:val="15"/>
   </w:num>
   <w:num w:numId="17" w16cid:durableId="973098943">
-    <w:abstractNumId w:val="11"/>
+    <w:abstractNumId w:val="12"/>
+  </w:num>
+  <w:num w:numId="18" w16cid:durableId="1034767421">
+    <w:abstractNumId w:val="10"/>
+  </w:num>
+  <w:num w:numId="19" w16cid:durableId="1426026605">
+    <w:abstractNumId w:val="16"/>
   </w:num>
 </w:numbering>
 </file>

</xml_diff>